<commit_message>
used lecture sldes to understand realtionships between feautres. Added task 4 eda, target analysis, outlier plots and correlation heatmap
</commit_message>
<xml_diff>
--- a/report/Progress Report - Data Engineering.docx
+++ b/report/Progress Report - Data Engineering.docx
@@ -40,15 +40,7 @@
         </w:numPr>
       </w:pPr>
       <w:r>
-        <w:t xml:space="preserve">Smaller cities have </w:t>
-      </w:r>
-      <w:proofErr w:type="spellStart"/>
-      <w:r>
-        <w:t>singinficant</w:t>
-      </w:r>
-      <w:proofErr w:type="spellEnd"/>
-      <w:r>
-        <w:t xml:space="preserve"> to all information missing </w:t>
+        <w:t xml:space="preserve">Smaller cities have singinficant to all information missing </w:t>
       </w:r>
       <w:r>
         <w:t>for sunshine weather</w:t>
@@ -62,11 +54,9 @@
           <w:numId w:val="1"/>
         </w:numPr>
       </w:pPr>
-      <w:proofErr w:type="spellStart"/>
       <w:r>
         <w:t>Evapo</w:t>
       </w:r>
-      <w:proofErr w:type="spellEnd"/>
     </w:p>
     <w:p/>
     <w:p>
@@ -1451,6 +1441,23 @@
 </file>
 
 <file path=customXml/item1.xml><?xml version="1.0" encoding="utf-8"?>
+<p:properties xmlns:p="http://schemas.microsoft.com/office/2006/metadata/properties" xmlns:xsi="http://www.w3.org/2001/XMLSchema-instance" xmlns:pc="http://schemas.microsoft.com/office/infopath/2007/PartnerControls">
+  <documentManagement>
+    <_activity xmlns="eb631033-6686-46ec-bdf0-10ab9533ed67" xsi:nil="true"/>
+  </documentManagement>
+</p:properties>
+</file>
+
+<file path=customXml/item2.xml><?xml version="1.0" encoding="utf-8"?>
+<?mso-contentType ?>
+<FormTemplates xmlns="http://schemas.microsoft.com/sharepoint/v3/contenttype/forms">
+  <Display>DocumentLibraryForm</Display>
+  <Edit>DocumentLibraryForm</Edit>
+  <New>DocumentLibraryForm</New>
+</FormTemplates>
+</file>
+
+<file path=customXml/item3.xml><?xml version="1.0" encoding="utf-8"?>
 <ct:contentTypeSchema xmlns:ct="http://schemas.microsoft.com/office/2006/metadata/contentType" xmlns:ma="http://schemas.microsoft.com/office/2006/metadata/properties/metaAttributes" ct:_="" ma:_="" ma:contentTypeName="Document" ma:contentTypeID="0x0101008533912DDF6A564D9F2B0E13A4DEE346" ma:contentTypeVersion="11" ma:contentTypeDescription="Create a new document." ma:contentTypeScope="" ma:versionID="006e0660f875f56585d9c7361aa210da">
   <xsd:schema xmlns:xsd="http://www.w3.org/2001/XMLSchema" xmlns:xs="http://www.w3.org/2001/XMLSchema" xmlns:p="http://schemas.microsoft.com/office/2006/metadata/properties" xmlns:ns3="eb631033-6686-46ec-bdf0-10ab9533ed67" targetNamespace="http://schemas.microsoft.com/office/2006/metadata/properties" ma:root="true" ma:fieldsID="30183b861765de917519170db8af0f01" ns3:_="">
     <xsd:import namespace="eb631033-6686-46ec-bdf0-10ab9533ed67"/>
@@ -1638,24 +1645,25 @@
 </ct:contentTypeSchema>
 </file>
 
-<file path=customXml/item2.xml><?xml version="1.0" encoding="utf-8"?>
-<?mso-contentType ?>
-<FormTemplates xmlns="http://schemas.microsoft.com/sharepoint/v3/contenttype/forms">
-  <Display>DocumentLibraryForm</Display>
-  <Edit>DocumentLibraryForm</Edit>
-  <New>DocumentLibraryForm</New>
-</FormTemplates>
+<file path=customXml/itemProps1.xml><?xml version="1.0" encoding="utf-8"?>
+<ds:datastoreItem xmlns:ds="http://schemas.openxmlformats.org/officeDocument/2006/customXml" ds:itemID="{DA90F16F-94F1-4781-9CC5-D2F621428335}">
+  <ds:schemaRefs>
+    <ds:schemaRef ds:uri="http://schemas.microsoft.com/office/2006/metadata/properties"/>
+    <ds:schemaRef ds:uri="http://schemas.microsoft.com/office/infopath/2007/PartnerControls"/>
+    <ds:schemaRef ds:uri="eb631033-6686-46ec-bdf0-10ab9533ed67"/>
+  </ds:schemaRefs>
+</ds:datastoreItem>
 </file>
 
-<file path=customXml/item3.xml><?xml version="1.0" encoding="utf-8"?>
-<p:properties xmlns:p="http://schemas.microsoft.com/office/2006/metadata/properties" xmlns:xsi="http://www.w3.org/2001/XMLSchema-instance" xmlns:pc="http://schemas.microsoft.com/office/infopath/2007/PartnerControls">
-  <documentManagement>
-    <_activity xmlns="eb631033-6686-46ec-bdf0-10ab9533ed67" xsi:nil="true"/>
-  </documentManagement>
-</p:properties>
+<file path=customXml/itemProps2.xml><?xml version="1.0" encoding="utf-8"?>
+<ds:datastoreItem xmlns:ds="http://schemas.openxmlformats.org/officeDocument/2006/customXml" ds:itemID="{7318EFCD-2801-40A4-BDA9-CFD02B80FF09}">
+  <ds:schemaRefs>
+    <ds:schemaRef ds:uri="http://schemas.microsoft.com/sharepoint/v3/contenttype/forms"/>
+  </ds:schemaRefs>
+</ds:datastoreItem>
 </file>
 
-<file path=customXml/itemProps1.xml><?xml version="1.0" encoding="utf-8"?>
+<file path=customXml/itemProps3.xml><?xml version="1.0" encoding="utf-8"?>
 <ds:datastoreItem xmlns:ds="http://schemas.openxmlformats.org/officeDocument/2006/customXml" ds:itemID="{F490161F-7A3D-4452-84FA-2F0F7635C576}">
   <ds:schemaRefs>
     <ds:schemaRef ds:uri="http://schemas.microsoft.com/office/2006/metadata/contentType"/>
@@ -1671,22 +1679,4 @@
     <ds:schemaRef ds:uri="http://schemas.microsoft.com/internal/obd"/>
   </ds:schemaRefs>
 </ds:datastoreItem>
-</file>
-
-<file path=customXml/itemProps2.xml><?xml version="1.0" encoding="utf-8"?>
-<ds:datastoreItem xmlns:ds="http://schemas.openxmlformats.org/officeDocument/2006/customXml" ds:itemID="{7318EFCD-2801-40A4-BDA9-CFD02B80FF09}">
-  <ds:schemaRefs>
-    <ds:schemaRef ds:uri="http://schemas.microsoft.com/sharepoint/v3/contenttype/forms"/>
-  </ds:schemaRefs>
-</ds:datastoreItem>
-</file>
-
-<file path=customXml/itemProps3.xml><?xml version="1.0" encoding="utf-8"?>
-<ds:datastoreItem xmlns:ds="http://schemas.openxmlformats.org/officeDocument/2006/customXml" ds:itemID="{DA90F16F-94F1-4781-9CC5-D2F621428335}">
-  <ds:schemaRefs>
-    <ds:schemaRef ds:uri="http://schemas.microsoft.com/office/2006/metadata/properties"/>
-    <ds:schemaRef ds:uri="http://schemas.microsoft.com/office/infopath/2007/PartnerControls"/>
-    <ds:schemaRef ds:uri="eb631033-6686-46ec-bdf0-10ab9533ed67"/>
-  </ds:schemaRefs>
-</ds:datastoreItem>
 </file>
</xml_diff>